<commit_message>
Fase 2 sintetizada: pseudocódigo del decodificador como figura propia
El procedimiento Decodificar se presenta detallado en la Figura 4
(19 líneas numeradas) y la Figura 3 remite a él.

Co-Authored-By: Claude Opus 5.5 <noreply@anthropic.com>
Claude-Session: https://claude.ai/code/session_01TVPKkpnk5SghcUD46f5dXj
</commit_message>
<xml_diff>
--- a/docs/Trabajo_de_Grado_con_Fase_2_sintetizada.docx
+++ b/docs/Trabajo_de_Grado_con_Fase_2_sintetizada.docx
@@ -15701,185 +15701,12 @@
               </w:rPr>
               <w:t>Decodificar(c)</w:t>
             </w:r>
-          </w:p>
-          <w:p>
-            <w:pPr>
-              <w:spacing w:after="0" w:line="240" w:lineRule="auto"/>
-              <w:jc w:val="left"/>
-            </w:pPr>
             <w:r>
               <w:rPr>
                 <w:rFonts w:ascii="Consolas" w:hAnsi="Consolas" w:cs="Consolas"/>
                 <w:sz w:val="18"/>
               </w:rPr>
-              <w:t xml:space="preserve">   </w:t>
-            </w:r>
-            <w:r>
-              <w:rPr>
-                <w:rFonts w:ascii="Consolas" w:hAnsi="Consolas" w:cs="Consolas"/>
-                <w:sz w:val="18"/>
-              </w:rPr>
-              <w:t>convertir π en docenas enteras (método del mayor residuo)</w:t>
-            </w:r>
-          </w:p>
-          <w:p>
-            <w:pPr>
-              <w:spacing w:after="0" w:line="240" w:lineRule="auto"/>
-              <w:jc w:val="left"/>
-            </w:pPr>
-            <w:r>
-              <w:rPr>
-                <w:rFonts w:ascii="Consolas" w:hAnsi="Consolas" w:cs="Consolas"/>
-                <w:sz w:val="18"/>
-              </w:rPr>
-              <w:t xml:space="preserve">   </w:t>
-            </w:r>
-            <w:r>
-              <w:rPr>
-                <w:rFonts w:ascii="Consolas" w:hAnsi="Consolas" w:cs="Consolas"/>
-                <w:sz w:val="18"/>
-              </w:rPr>
-              <w:t>para s = 1 hasta 4, para cada sublote (j, b) en el orden O(s):</w:t>
-            </w:r>
-          </w:p>
-          <w:p>
-            <w:pPr>
-              <w:spacing w:after="0" w:line="240" w:lineRule="auto"/>
-              <w:jc w:val="left"/>
-            </w:pPr>
-            <w:r>
-              <w:rPr>
-                <w:rFonts w:ascii="Consolas" w:hAnsi="Consolas" w:cs="Consolas"/>
-                <w:sz w:val="18"/>
-              </w:rPr>
-              <w:t xml:space="preserve">      </w:t>
-            </w:r>
-            <w:r>
-              <w:rPr>
-                <w:rFonts w:ascii="Consolas" w:hAnsi="Consolas" w:cs="Consolas"/>
-                <w:sz w:val="18"/>
-              </w:rPr>
-              <w:t>listo ← r(j) si s = 1; si no, terminación de (j, b) en la etapa s − 1</w:t>
-            </w:r>
-          </w:p>
-          <w:p>
-            <w:pPr>
-              <w:spacing w:after="0" w:line="240" w:lineRule="auto"/>
-              <w:jc w:val="left"/>
-            </w:pPr>
-            <w:r>
-              <w:rPr>
-                <w:rFonts w:ascii="Consolas" w:hAnsi="Consolas" w:cs="Consolas"/>
-                <w:sz w:val="18"/>
-              </w:rPr>
-              <w:t xml:space="preserve">      </w:t>
-            </w:r>
-            <w:r>
-              <w:rPr>
-                <w:rFonts w:ascii="Consolas" w:hAnsi="Consolas" w:cs="Consolas"/>
-                <w:sz w:val="18"/>
-              </w:rPr>
-              <w:t>para cada máquina m de la etapa s:</w:t>
-            </w:r>
-          </w:p>
-          <w:p>
-            <w:pPr>
-              <w:spacing w:after="0" w:line="240" w:lineRule="auto"/>
-              <w:jc w:val="left"/>
-            </w:pPr>
-            <w:r>
-              <w:rPr>
-                <w:rFonts w:ascii="Consolas" w:hAnsi="Consolas" w:cs="Consolas"/>
-                <w:sz w:val="18"/>
-              </w:rPr>
-              <w:t xml:space="preserve">         </w:t>
-            </w:r>
-            <w:r>
-              <w:rPr>
-                <w:rFonts w:ascii="Consolas" w:hAnsi="Consolas" w:cs="Consolas"/>
-                <w:sz w:val="18"/>
-              </w:rPr>
-              <w:t>troquelado: inicio ← máx(libre(m) + alistamiento, listo)</w:t>
-            </w:r>
-          </w:p>
-          <w:p>
-            <w:pPr>
-              <w:spacing w:after="0" w:line="240" w:lineRule="auto"/>
-              <w:jc w:val="left"/>
-            </w:pPr>
-            <w:r>
-              <w:rPr>
-                <w:rFonts w:ascii="Consolas" w:hAnsi="Consolas" w:cs="Consolas"/>
-                <w:sz w:val="18"/>
-              </w:rPr>
-              <w:t xml:space="preserve">         </w:t>
-            </w:r>
-            <w:r>
-              <w:rPr>
-                <w:rFonts w:ascii="Consolas" w:hAnsi="Consolas" w:cs="Consolas"/>
-                <w:sz w:val="18"/>
-              </w:rPr>
-              <w:t>otras etapas: inicio ← primer hueco libre de m desde listo</w:t>
-            </w:r>
-          </w:p>
-          <w:p>
-            <w:pPr>
-              <w:spacing w:after="0" w:line="240" w:lineRule="auto"/>
-              <w:jc w:val="left"/>
-            </w:pPr>
-            <w:r>
-              <w:rPr>
-                <w:rFonts w:ascii="Consolas" w:hAnsi="Consolas" w:cs="Consolas"/>
-                <w:sz w:val="18"/>
-              </w:rPr>
-              <w:t xml:space="preserve">         </w:t>
-            </w:r>
-            <w:r>
-              <w:rPr>
-                <w:rFonts w:ascii="Consolas" w:hAnsi="Consolas" w:cs="Consolas"/>
-                <w:sz w:val="18"/>
-              </w:rPr>
-              <w:t>fin(m) ← inicio + a(j,m)·x(j,b)</w:t>
-            </w:r>
-          </w:p>
-          <w:p>
-            <w:pPr>
-              <w:spacing w:after="0" w:line="240" w:lineRule="auto"/>
-              <w:jc w:val="left"/>
-            </w:pPr>
-            <w:r>
-              <w:rPr>
-                <w:rFonts w:ascii="Consolas" w:hAnsi="Consolas" w:cs="Consolas"/>
-                <w:sz w:val="18"/>
-              </w:rPr>
-              <w:t xml:space="preserve">      </w:t>
-            </w:r>
-            <w:r>
-              <w:rPr>
-                <w:rFonts w:ascii="Consolas" w:hAnsi="Consolas" w:cs="Consolas"/>
-                <w:sz w:val="18"/>
-              </w:rPr>
-              <w:t>asignar (j, b) a la máquina con menor fin(m)       ▹ regla ECT</w:t>
-            </w:r>
-          </w:p>
-          <w:p>
-            <w:pPr>
-              <w:spacing w:after="0" w:line="240" w:lineRule="auto"/>
-              <w:jc w:val="left"/>
-            </w:pPr>
-            <w:r>
-              <w:rPr>
-                <w:rFonts w:ascii="Consolas" w:hAnsi="Consolas" w:cs="Consolas"/>
-                <w:sz w:val="18"/>
-              </w:rPr>
-              <w:t xml:space="preserve">   </w:t>
-            </w:r>
-            <w:r>
-              <w:rPr>
-                <w:rFonts w:ascii="Consolas" w:hAnsi="Consolas" w:cs="Consolas"/>
-                <w:sz w:val="18"/>
-              </w:rPr>
-              <w:t>C(j) ← máx_b fin(j, b);  T(j) ← máx(0, C(j) − d(j));  calcular ΣT y Cmax</w:t>
+              <w:t>: construye la programación del cromosoma (Figura 4)</w:t>
             </w:r>
           </w:p>
         </w:tc>
@@ -17098,7 +16925,7 @@
         </m:sSub>
       </m:oMath>
       <w:r>
-        <w:t xml:space="preserve"> y, para cada uno, calcula en cada máquina el inicio posible a partir del momento en que el sublote está disponible (la liberación de la orden en troquelado o su terminación en la etapa anterior). En troquelado, el sublote se ubica después del último de la máquina y se suma el alistamiento si cambia la referencia; en las demás etapas ocupa el primer intervalo libre. El sublote se asigna a la máquina en la que termina primero. La programación resultante cumple por construcción todas las restricciones del modelo. La aptitud de un cromosoma es el par (</w:t>
+        <w:t xml:space="preserve"> y, para cada uno, calcula en cada máquina el inicio posible a partir del momento en que el sublote está disponible (la liberación de la orden en troquelado o su terminación en la etapa anterior). En troquelado, el sublote se ubica después del último de la máquina y se suma el alistamiento si cambia la referencia; en las demás etapas ocupa el primer intervalo libre. El sublote se asigna a la máquina en la que termina primero. La programación resultante cumple por construcción todas las restricciones del modelo. La Figura 4 presenta el procedimiento. La aptitud de un cromosoma es el par (</w:t>
       </w:r>
       <m:oMath>
         <m:r>
@@ -17144,6 +16971,480 @@
         <w:t>) de su programación, comparado de forma lexicográfica.</w:t>
       </w:r>
     </w:p>
+    <w:p>
+      <w:pPr>
+        <w:pStyle w:val="Descripcin"/>
+        <w:keepNext/>
+      </w:pPr>
+      <w:r>
+        <w:rPr>
+          <w:color w:val="000000"/>
+          <w:sz w:val="20"/>
+        </w:rPr>
+        <w:t xml:space="preserve">Figura </w:t>
+      </w:r>
+      <w:r>
+        <w:rPr>
+          <w:color w:val="000000"/>
+          <w:sz w:val="20"/>
+        </w:rPr>
+        <w:fldChar w:fldCharType="begin"/>
+      </w:r>
+      <w:r>
+        <w:rPr>
+          <w:color w:val="000000"/>
+          <w:sz w:val="20"/>
+        </w:rPr>
+        <w:instrText xml:space="preserve"> SEQ Figura \* ARABIC </w:instrText>
+      </w:r>
+      <w:r>
+        <w:rPr>
+          <w:color w:val="000000"/>
+          <w:sz w:val="20"/>
+        </w:rPr>
+        <w:fldChar w:fldCharType="separate"/>
+      </w:r>
+      <w:r>
+        <w:rPr>
+          <w:color w:val="000000"/>
+          <w:sz w:val="20"/>
+        </w:rPr>
+        <w:t>2</w:t>
+      </w:r>
+      <w:r>
+        <w:rPr>
+          <w:color w:val="000000"/>
+          <w:sz w:val="20"/>
+        </w:rPr>
+        <w:fldChar w:fldCharType="end"/>
+      </w:r>
+      <w:r>
+        <w:rPr>
+          <w:color w:val="000000"/>
+          <w:sz w:val="20"/>
+        </w:rPr>
+        <w:t>. Pseudocódigo del procedimiento de decodificación</w:t>
+      </w:r>
+    </w:p>
+    <w:tbl>
+      <w:tblPr>
+        <w:tblStyle w:val="Tablaconcuadrcula"/>
+        <w:tblW w:type="auto" w:w="0"/>
+        <w:jc w:val="center"/>
+        <w:tblBorders>
+          <w:left w:val="none" w:sz="0" w:space="0" w:color="auto"/>
+          <w:right w:val="none" w:sz="0" w:space="0" w:color="auto"/>
+          <w:insideH w:val="none" w:sz="0" w:space="0" w:color="auto"/>
+          <w:insideV w:val="none" w:sz="0" w:space="0" w:color="auto"/>
+        </w:tblBorders>
+        <w:tblLayout w:type="fixed"/>
+        <w:tblLook w:firstColumn="1" w:firstRow="1" w:lastColumn="0" w:lastRow="0" w:noHBand="0" w:noVBand="1" w:val="04A0"/>
+      </w:tblPr>
+      <w:tblGrid>
+        <w:gridCol w:w="8838"/>
+      </w:tblGrid>
+      <w:tr>
+        <w:trPr>
+          <w:cantSplit/>
+        </w:trPr>
+        <w:tc>
+          <w:tcPr>
+            <w:tcW w:type="dxa" w:w="8838"/>
+          </w:tcPr>
+          <w:p>
+            <w:pPr>
+              <w:spacing w:after="0" w:line="240" w:lineRule="auto"/>
+              <w:jc w:val="left"/>
+            </w:pPr>
+            <w:r>
+              <w:rPr>
+                <w:rFonts w:ascii="Consolas" w:hAnsi="Consolas" w:cs="Consolas"/>
+                <w:b/>
+                <w:sz w:val="18"/>
+              </w:rPr>
+              <w:t>Procedimiento Decodificar(c)</w:t>
+            </w:r>
+          </w:p>
+          <w:p>
+            <w:pPr>
+              <w:spacing w:after="0" w:line="240" w:lineRule="auto"/>
+              <w:jc w:val="left"/>
+            </w:pPr>
+            <w:r>
+              <w:rPr>
+                <w:rFonts w:ascii="Consolas" w:hAnsi="Consolas" w:cs="Consolas"/>
+                <w:sz w:val="18"/>
+              </w:rPr>
+              <w:t>Entrada: cromosoma c = (π, O1, O2, O3, O4) y datos de la instancia</w:t>
+            </w:r>
+          </w:p>
+          <w:p>
+            <w:pPr>
+              <w:spacing w:after="0" w:line="240" w:lineRule="auto"/>
+              <w:jc w:val="left"/>
+            </w:pPr>
+            <w:r>
+              <w:rPr>
+                <w:rFonts w:ascii="Consolas" w:hAnsi="Consolas" w:cs="Consolas"/>
+                <w:sz w:val="18"/>
+              </w:rPr>
+              <w:t>Salida:  máquina, inicio y fin de cada sublote; ΣT y Cmax</w:t>
+            </w:r>
+          </w:p>
+          <w:p>
+            <w:pPr>
+              <w:spacing w:after="0" w:line="240" w:lineRule="auto"/>
+              <w:jc w:val="left"/>
+            </w:pPr>
+            <w:r>
+              <w:rPr>
+                <w:rFonts w:ascii="Consolas" w:hAnsi="Consolas" w:cs="Consolas"/>
+                <w:sz w:val="18"/>
+              </w:rPr>
+              <w:t xml:space="preserve"> </w:t>
+            </w:r>
+            <w:r>
+              <w:rPr>
+                <w:rFonts w:ascii="Consolas" w:hAnsi="Consolas" w:cs="Consolas"/>
+                <w:sz w:val="18"/>
+              </w:rPr>
+              <w:t>1  para cada orden j: x(j,·) ← docenas a partir de π(j)        ▹ ecuación (17)</w:t>
+            </w:r>
+          </w:p>
+          <w:p>
+            <w:pPr>
+              <w:spacing w:after="0" w:line="240" w:lineRule="auto"/>
+              <w:jc w:val="left"/>
+            </w:pPr>
+            <w:r>
+              <w:rPr>
+                <w:rFonts w:ascii="Consolas" w:hAnsi="Consolas" w:cs="Consolas"/>
+                <w:sz w:val="18"/>
+              </w:rPr>
+              <w:t xml:space="preserve"> </w:t>
+            </w:r>
+            <w:r>
+              <w:rPr>
+                <w:rFonts w:ascii="Consolas" w:hAnsi="Consolas" w:cs="Consolas"/>
+                <w:sz w:val="18"/>
+              </w:rPr>
+              <w:t>2  para cada sublote (j, b): listo(j, b) ← r(j)</w:t>
+            </w:r>
+          </w:p>
+          <w:p>
+            <w:pPr>
+              <w:spacing w:after="0" w:line="240" w:lineRule="auto"/>
+              <w:jc w:val="left"/>
+            </w:pPr>
+            <w:r>
+              <w:rPr>
+                <w:rFonts w:ascii="Consolas" w:hAnsi="Consolas" w:cs="Consolas"/>
+                <w:sz w:val="18"/>
+              </w:rPr>
+              <w:t xml:space="preserve"> </w:t>
+            </w:r>
+            <w:r>
+              <w:rPr>
+                <w:rFonts w:ascii="Consolas" w:hAnsi="Consolas" w:cs="Consolas"/>
+                <w:sz w:val="18"/>
+              </w:rPr>
+              <w:t>3  para cada máquina m: agenda(m) ← vacía; libre(m) ← 0; ref(m) ← ninguna</w:t>
+            </w:r>
+          </w:p>
+          <w:p>
+            <w:pPr>
+              <w:spacing w:after="0" w:line="240" w:lineRule="auto"/>
+              <w:jc w:val="left"/>
+            </w:pPr>
+            <w:r>
+              <w:rPr>
+                <w:rFonts w:ascii="Consolas" w:hAnsi="Consolas" w:cs="Consolas"/>
+                <w:sz w:val="18"/>
+              </w:rPr>
+              <w:t xml:space="preserve"> </w:t>
+            </w:r>
+            <w:r>
+              <w:rPr>
+                <w:rFonts w:ascii="Consolas" w:hAnsi="Consolas" w:cs="Consolas"/>
+                <w:sz w:val="18"/>
+              </w:rPr>
+              <w:t>4  para s = 1 hasta 4 hacer</w:t>
+            </w:r>
+          </w:p>
+          <w:p>
+            <w:pPr>
+              <w:spacing w:after="0" w:line="240" w:lineRule="auto"/>
+              <w:jc w:val="left"/>
+            </w:pPr>
+            <w:r>
+              <w:rPr>
+                <w:rFonts w:ascii="Consolas" w:hAnsi="Consolas" w:cs="Consolas"/>
+                <w:sz w:val="18"/>
+              </w:rPr>
+              <w:t xml:space="preserve"> </w:t>
+            </w:r>
+            <w:r>
+              <w:rPr>
+                <w:rFonts w:ascii="Consolas" w:hAnsi="Consolas" w:cs="Consolas"/>
+                <w:sz w:val="18"/>
+              </w:rPr>
+              <w:t>5     para cada sublote (j, b) en el orden O(s) hacer</w:t>
+            </w:r>
+          </w:p>
+          <w:p>
+            <w:pPr>
+              <w:spacing w:after="0" w:line="240" w:lineRule="auto"/>
+              <w:jc w:val="left"/>
+            </w:pPr>
+            <w:r>
+              <w:rPr>
+                <w:rFonts w:ascii="Consolas" w:hAnsi="Consolas" w:cs="Consolas"/>
+                <w:sz w:val="18"/>
+              </w:rPr>
+              <w:t xml:space="preserve"> </w:t>
+            </w:r>
+            <w:r>
+              <w:rPr>
+                <w:rFonts w:ascii="Consolas" w:hAnsi="Consolas" w:cs="Consolas"/>
+                <w:sz w:val="18"/>
+              </w:rPr>
+              <w:t>6        para cada máquina m de la etapa s hacer</w:t>
+            </w:r>
+          </w:p>
+          <w:p>
+            <w:pPr>
+              <w:spacing w:after="0" w:line="240" w:lineRule="auto"/>
+              <w:jc w:val="left"/>
+            </w:pPr>
+            <w:r>
+              <w:rPr>
+                <w:rFonts w:ascii="Consolas" w:hAnsi="Consolas" w:cs="Consolas"/>
+                <w:sz w:val="18"/>
+              </w:rPr>
+              <w:t xml:space="preserve"> </w:t>
+            </w:r>
+            <w:r>
+              <w:rPr>
+                <w:rFonts w:ascii="Consolas" w:hAnsi="Consolas" w:cs="Consolas"/>
+                <w:sz w:val="18"/>
+              </w:rPr>
+              <w:t>7           t ← a(j,m) · x(j,b)                         ▹ tiempo de proceso</w:t>
+            </w:r>
+          </w:p>
+          <w:p>
+            <w:pPr>
+              <w:spacing w:after="0" w:line="240" w:lineRule="auto"/>
+              <w:jc w:val="left"/>
+            </w:pPr>
+            <w:r>
+              <w:rPr>
+                <w:rFonts w:ascii="Consolas" w:hAnsi="Consolas" w:cs="Consolas"/>
+                <w:sz w:val="18"/>
+              </w:rPr>
+              <w:t xml:space="preserve"> </w:t>
+            </w:r>
+            <w:r>
+              <w:rPr>
+                <w:rFonts w:ascii="Consolas" w:hAnsi="Consolas" w:cs="Consolas"/>
+                <w:sz w:val="18"/>
+              </w:rPr>
+              <w:t>8           si s = 1 entonces                                ▹ troquelado</w:t>
+            </w:r>
+          </w:p>
+          <w:p>
+            <w:pPr>
+              <w:spacing w:after="0" w:line="240" w:lineRule="auto"/>
+              <w:jc w:val="left"/>
+            </w:pPr>
+            <w:r>
+              <w:rPr>
+                <w:rFonts w:ascii="Consolas" w:hAnsi="Consolas" w:cs="Consolas"/>
+                <w:sz w:val="18"/>
+              </w:rPr>
+              <w:t xml:space="preserve"> </w:t>
+            </w:r>
+            <w:r>
+              <w:rPr>
+                <w:rFonts w:ascii="Consolas" w:hAnsi="Consolas" w:cs="Consolas"/>
+                <w:sz w:val="18"/>
+              </w:rPr>
+              <w:t>9              α ← σ si ref(m) = ninguna o ref(m) ≠ p(j); si no α ← 0</w:t>
+            </w:r>
+          </w:p>
+          <w:p>
+            <w:pPr>
+              <w:spacing w:after="0" w:line="240" w:lineRule="auto"/>
+              <w:jc w:val="left"/>
+            </w:pPr>
+            <w:r>
+              <w:rPr>
+                <w:rFonts w:ascii="Consolas" w:hAnsi="Consolas" w:cs="Consolas"/>
+                <w:sz w:val="18"/>
+              </w:rPr>
+              <w:t>10              inicio(m) ← máx(libre(m) + α, listo(j, b))</w:t>
+            </w:r>
+          </w:p>
+          <w:p>
+            <w:pPr>
+              <w:spacing w:after="0" w:line="240" w:lineRule="auto"/>
+              <w:jc w:val="left"/>
+            </w:pPr>
+            <w:r>
+              <w:rPr>
+                <w:rFonts w:ascii="Consolas" w:hAnsi="Consolas" w:cs="Consolas"/>
+                <w:sz w:val="18"/>
+              </w:rPr>
+              <w:t>11           si no</w:t>
+            </w:r>
+          </w:p>
+          <w:p>
+            <w:pPr>
+              <w:spacing w:after="0" w:line="240" w:lineRule="auto"/>
+              <w:jc w:val="left"/>
+            </w:pPr>
+            <w:r>
+              <w:rPr>
+                <w:rFonts w:ascii="Consolas" w:hAnsi="Consolas" w:cs="Consolas"/>
+                <w:sz w:val="18"/>
+              </w:rPr>
+              <w:t>12              inicio(m) ← primer hueco de agenda(m) de duración t</w:t>
+            </w:r>
+          </w:p>
+          <w:p>
+            <w:pPr>
+              <w:spacing w:after="0" w:line="240" w:lineRule="auto"/>
+              <w:jc w:val="left"/>
+            </w:pPr>
+            <w:r>
+              <w:rPr>
+                <w:rFonts w:ascii="Consolas" w:hAnsi="Consolas" w:cs="Consolas"/>
+                <w:sz w:val="18"/>
+              </w:rPr>
+              <w:t xml:space="preserve">                             </w:t>
+            </w:r>
+            <w:r>
+              <w:rPr>
+                <w:rFonts w:ascii="Consolas" w:hAnsi="Consolas" w:cs="Consolas"/>
+                <w:sz w:val="18"/>
+              </w:rPr>
+              <w:t>que empiece en o después de listo(j, b)</w:t>
+            </w:r>
+          </w:p>
+          <w:p>
+            <w:pPr>
+              <w:spacing w:after="0" w:line="240" w:lineRule="auto"/>
+              <w:jc w:val="left"/>
+            </w:pPr>
+            <w:r>
+              <w:rPr>
+                <w:rFonts w:ascii="Consolas" w:hAnsi="Consolas" w:cs="Consolas"/>
+                <w:sz w:val="18"/>
+              </w:rPr>
+              <w:t>13           fin(m) ← inicio(m) + t</w:t>
+            </w:r>
+          </w:p>
+          <w:p>
+            <w:pPr>
+              <w:spacing w:after="0" w:line="240" w:lineRule="auto"/>
+              <w:jc w:val="left"/>
+            </w:pPr>
+            <w:r>
+              <w:rPr>
+                <w:rFonts w:ascii="Consolas" w:hAnsi="Consolas" w:cs="Consolas"/>
+                <w:sz w:val="18"/>
+              </w:rPr>
+              <w:t>14        m′ ← máquina con menor fin(m); si hay empate, la de menor índice</w:t>
+            </w:r>
+          </w:p>
+          <w:p>
+            <w:pPr>
+              <w:spacing w:after="0" w:line="240" w:lineRule="auto"/>
+              <w:jc w:val="left"/>
+            </w:pPr>
+            <w:r>
+              <w:rPr>
+                <w:rFonts w:ascii="Consolas" w:hAnsi="Consolas" w:cs="Consolas"/>
+                <w:sz w:val="18"/>
+              </w:rPr>
+              <w:t xml:space="preserve">                                                             </w:t>
+            </w:r>
+            <w:r>
+              <w:rPr>
+                <w:rFonts w:ascii="Consolas" w:hAnsi="Consolas" w:cs="Consolas"/>
+                <w:sz w:val="18"/>
+              </w:rPr>
+              <w:t>▹ regla ECT</w:t>
+            </w:r>
+          </w:p>
+          <w:p>
+            <w:pPr>
+              <w:spacing w:after="0" w:line="240" w:lineRule="auto"/>
+              <w:jc w:val="left"/>
+            </w:pPr>
+            <w:r>
+              <w:rPr>
+                <w:rFonts w:ascii="Consolas" w:hAnsi="Consolas" w:cs="Consolas"/>
+                <w:sz w:val="18"/>
+              </w:rPr>
+              <w:t>15        registrar (j, b) en agenda(m′) entre inicio(m′) y fin(m′)</w:t>
+            </w:r>
+          </w:p>
+          <w:p>
+            <w:pPr>
+              <w:spacing w:after="0" w:line="240" w:lineRule="auto"/>
+              <w:jc w:val="left"/>
+            </w:pPr>
+            <w:r>
+              <w:rPr>
+                <w:rFonts w:ascii="Consolas" w:hAnsi="Consolas" w:cs="Consolas"/>
+                <w:sz w:val="18"/>
+              </w:rPr>
+              <w:t>16        si s = 1 entonces libre(m′) ← fin(m′); ref(m′) ← p(j)</w:t>
+            </w:r>
+          </w:p>
+          <w:p>
+            <w:pPr>
+              <w:spacing w:after="0" w:line="240" w:lineRule="auto"/>
+              <w:jc w:val="left"/>
+            </w:pPr>
+            <w:r>
+              <w:rPr>
+                <w:rFonts w:ascii="Consolas" w:hAnsi="Consolas" w:cs="Consolas"/>
+                <w:sz w:val="18"/>
+              </w:rPr>
+              <w:t>17        listo(j, b) ← fin(m′)               ▹ disponible para la etapa s + 1</w:t>
+            </w:r>
+          </w:p>
+          <w:p>
+            <w:pPr>
+              <w:spacing w:after="0" w:line="240" w:lineRule="auto"/>
+              <w:jc w:val="left"/>
+            </w:pPr>
+            <w:r>
+              <w:rPr>
+                <w:rFonts w:ascii="Consolas" w:hAnsi="Consolas" w:cs="Consolas"/>
+                <w:sz w:val="18"/>
+              </w:rPr>
+              <w:t>18  para cada orden j: C(j) ← máx_b listo(j, b); T(j) ← máx(0, C(j) − d(j))</w:t>
+            </w:r>
+          </w:p>
+          <w:p>
+            <w:pPr>
+              <w:spacing w:after="0" w:line="240" w:lineRule="auto"/>
+              <w:jc w:val="left"/>
+            </w:pPr>
+            <w:r>
+              <w:rPr>
+                <w:rFonts w:ascii="Consolas" w:hAnsi="Consolas" w:cs="Consolas"/>
+                <w:sz w:val="18"/>
+              </w:rPr>
+              <w:t>19  devolver la programación, ΣT = Σ_j T(j) y Cmax = máx_j C(j)</w:t>
+            </w:r>
+          </w:p>
+        </w:tc>
+      </w:tr>
+    </w:tbl>
+    <w:p/>
     <w:p>
       <w:pPr>
         <w:keepNext/>
@@ -23061,7 +23362,7 @@
     <w:p/>
     <w:p>
       <w:r>
-        <w:t>La población y la probabilidad de mutación tienen efecto significativo sobre la tardanza (p &lt; 0,001); la probabilidad de cruce y las interacciones no lo tienen. Los residuos son normales (Shapiro-Wilk, p = 0,459), pero las varianzas no son homogéneas entre niveles, por lo que el resultado se confirmó con la prueba no paramétrica de Kruskal-Wallis, que coincide con el ANOVA. Como muestra la Figura 4, la tardanza disminuye al aumentar la población y la mutación. La combinación de población 150, cruce 0,9 y mutación 0,5 fue la única que eliminó la tardanza en las cinco réplicas (makespan promedio de 652,3 h).</w:t>
+        <w:t>La población y la probabilidad de mutación tienen efecto significativo sobre la tardanza (p &lt; 0,001); la probabilidad de cruce y las interacciones no lo tienen. Los residuos son normales (Shapiro-Wilk, p = 0,459), pero las varianzas no son homogéneas entre niveles, por lo que el resultado se confirmó con la prueba no paramétrica de Kruskal-Wallis, que coincide con el ANOVA. Como muestra la Figura 5, la tardanza disminuye al aumentar la población y la mutación. La combinación de población 150, cruce 0,9 y mutación 0,5 fue la única que eliminó la tardanza en las cinco réplicas (makespan promedio de 652,3 h).</w:t>
       </w:r>
     </w:p>
     <w:p>
@@ -23102,7 +23403,7 @@
           <w:color w:val="000000"/>
           <w:sz w:val="20"/>
         </w:rPr>
-        <w:t>2</w:t>
+        <w:t>3</w:t>
       </w:r>
       <w:r>
         <w:rPr>
@@ -28555,7 +28856,7 @@
     <w:p/>
     <w:p>
       <w:r>
-        <w:t>Ninguna orden termina después de su fecha de entrega. La Tabla 18 resume los indicadores globales; la ocupación de cada etapa es su tiempo de procesamiento dividido entre el número de máquinas por el makespan. Troquelado, el cuello de botella identificado en la caracterización, tiene la mayor ocupación (81,7 %). La Figura 5 presenta el diagrama de Gantt.</w:t>
+        <w:t>Ninguna orden termina después de su fecha de entrega. La Tabla 18 resume los indicadores globales; la ocupación de cada etapa es su tiempo de procesamiento dividido entre el número de máquinas por el makespan. Troquelado, el cuello de botella identificado en la caracterización, tiene la mayor ocupación (81,7 %). La Figura 6 presenta el diagrama de Gantt.</w:t>
       </w:r>
     </w:p>
     <w:p>
@@ -29135,7 +29436,7 @@
           <w:color w:val="000000"/>
           <w:sz w:val="20"/>
         </w:rPr>
-        <w:t>3</w:t>
+        <w:t>4</w:t>
       </w:r>
       <w:r>
         <w:rPr>

</xml_diff>